<commit_message>
add normlezed data model diagram
</commit_message>
<xml_diff>
--- a/Sprint3/Requirements Analysis and Design Completed.docx
+++ b/Sprint3/Requirements Analysis and Design Completed.docx
@@ -7840,11 +7840,6 @@
     </w:p>
     <w:p>
       <w:pPr>
-        <w:pStyle w:val="ListParagraph"/>
-        <w:numPr>
-          <w:ilvl w:val="0"/>
-          <w:numId w:val="21"/>
-        </w:numPr>
         <w:autoSpaceDE w:val="0"/>
         <w:autoSpaceDN w:val="0"/>
         <w:adjustRightInd w:val="0"/>
@@ -7855,32 +7850,13 @@
       </w:pPr>
       <w:r>
         <w:rPr>
-          <w:rFonts w:ascii="Arial" w:hAnsi="Arial" w:cs="Arial"/>
-          <w:lang w:val="en-US"/>
-        </w:rPr>
-        <w:t>Activity Diagrams</w:t>
-      </w:r>
-    </w:p>
-    <w:p>
-      <w:pPr>
-        <w:autoSpaceDE w:val="0"/>
-        <w:autoSpaceDN w:val="0"/>
-        <w:adjustRightInd w:val="0"/>
-        <w:rPr>
-          <w:rFonts w:ascii="Arial" w:hAnsi="Arial" w:cs="Arial"/>
-          <w:lang w:val="en-US"/>
-        </w:rPr>
-      </w:pPr>
-      <w:r>
-        <w:rPr>
-          <w:rFonts w:ascii="Arial" w:hAnsi="Arial" w:cs="Arial"/>
           <w:noProof/>
         </w:rPr>
         <w:drawing>
-          <wp:inline distT="0" distB="0" distL="0" distR="0" wp14:anchorId="4D9C7A8C" wp14:editId="5F7DC42C">
-            <wp:extent cx="5486400" cy="3795395"/>
+          <wp:inline distT="0" distB="0" distL="0" distR="0" wp14:anchorId="6D0D65CA" wp14:editId="07ECA27C">
+            <wp:extent cx="5486400" cy="3326765"/>
             <wp:effectExtent l="0" t="0" r="0" b="0"/>
-            <wp:docPr id="2" name="Picture 2"/>
+            <wp:docPr id="6" name="Picture 6"/>
             <wp:cNvGraphicFramePr>
               <a:graphicFrameLocks xmlns:a="http://schemas.openxmlformats.org/drawingml/2006/main" noChangeAspect="1"/>
             </wp:cNvGraphicFramePr>
@@ -7900,7 +7876,7 @@
                   <pic:spPr>
                     <a:xfrm>
                       <a:off x="0" y="0"/>
-                      <a:ext cx="5486400" cy="3795395"/>
+                      <a:ext cx="5486400" cy="3326765"/>
                     </a:xfrm>
                     <a:prstGeom prst="rect">
                       <a:avLst/>
@@ -7915,261 +7891,6 @@
     </w:p>
     <w:p>
       <w:pPr>
-        <w:autoSpaceDE w:val="0"/>
-        <w:autoSpaceDN w:val="0"/>
-        <w:adjustRightInd w:val="0"/>
-        <w:rPr>
-          <w:rFonts w:ascii="Arial" w:hAnsi="Arial" w:cs="Arial"/>
-          <w:lang w:val="en-US"/>
-        </w:rPr>
-      </w:pPr>
-    </w:p>
-    <w:p>
-      <w:pPr>
-        <w:autoSpaceDE w:val="0"/>
-        <w:autoSpaceDN w:val="0"/>
-        <w:adjustRightInd w:val="0"/>
-        <w:rPr>
-          <w:rFonts w:ascii="Arial" w:hAnsi="Arial" w:cs="Arial"/>
-          <w:lang w:val="en-US"/>
-        </w:rPr>
-      </w:pPr>
-    </w:p>
-    <w:p>
-      <w:pPr>
-        <w:autoSpaceDE w:val="0"/>
-        <w:autoSpaceDN w:val="0"/>
-        <w:adjustRightInd w:val="0"/>
-        <w:rPr>
-          <w:rFonts w:ascii="Arial" w:hAnsi="Arial" w:cs="Arial"/>
-          <w:lang w:val="en-US"/>
-        </w:rPr>
-      </w:pPr>
-    </w:p>
-    <w:p>
-      <w:pPr>
-        <w:autoSpaceDE w:val="0"/>
-        <w:autoSpaceDN w:val="0"/>
-        <w:adjustRightInd w:val="0"/>
-        <w:rPr>
-          <w:rFonts w:ascii="Arial" w:hAnsi="Arial" w:cs="Arial"/>
-          <w:lang w:val="en-US"/>
-        </w:rPr>
-      </w:pPr>
-    </w:p>
-    <w:p>
-      <w:pPr>
-        <w:autoSpaceDE w:val="0"/>
-        <w:autoSpaceDN w:val="0"/>
-        <w:adjustRightInd w:val="0"/>
-        <w:rPr>
-          <w:rFonts w:ascii="Arial" w:hAnsi="Arial" w:cs="Arial"/>
-          <w:lang w:val="en-US"/>
-        </w:rPr>
-      </w:pPr>
-    </w:p>
-    <w:p>
-      <w:pPr>
-        <w:autoSpaceDE w:val="0"/>
-        <w:autoSpaceDN w:val="0"/>
-        <w:adjustRightInd w:val="0"/>
-        <w:rPr>
-          <w:rFonts w:ascii="Arial" w:hAnsi="Arial" w:cs="Arial"/>
-          <w:lang w:val="en-US"/>
-        </w:rPr>
-      </w:pPr>
-    </w:p>
-    <w:p>
-      <w:pPr>
-        <w:autoSpaceDE w:val="0"/>
-        <w:autoSpaceDN w:val="0"/>
-        <w:adjustRightInd w:val="0"/>
-        <w:rPr>
-          <w:rFonts w:ascii="Arial" w:hAnsi="Arial" w:cs="Arial"/>
-          <w:lang w:val="en-US"/>
-        </w:rPr>
-      </w:pPr>
-    </w:p>
-    <w:p>
-      <w:pPr>
-        <w:autoSpaceDE w:val="0"/>
-        <w:autoSpaceDN w:val="0"/>
-        <w:adjustRightInd w:val="0"/>
-        <w:rPr>
-          <w:rFonts w:ascii="Arial" w:hAnsi="Arial" w:cs="Arial"/>
-          <w:lang w:val="en-US"/>
-        </w:rPr>
-      </w:pPr>
-    </w:p>
-    <w:p>
-      <w:pPr>
-        <w:autoSpaceDE w:val="0"/>
-        <w:autoSpaceDN w:val="0"/>
-        <w:adjustRightInd w:val="0"/>
-        <w:rPr>
-          <w:rFonts w:ascii="Arial" w:hAnsi="Arial" w:cs="Arial"/>
-          <w:lang w:val="en-US"/>
-        </w:rPr>
-      </w:pPr>
-    </w:p>
-    <w:p>
-      <w:pPr>
-        <w:autoSpaceDE w:val="0"/>
-        <w:autoSpaceDN w:val="0"/>
-        <w:adjustRightInd w:val="0"/>
-        <w:rPr>
-          <w:rFonts w:ascii="Arial" w:hAnsi="Arial" w:cs="Arial"/>
-          <w:lang w:val="en-US"/>
-        </w:rPr>
-      </w:pPr>
-    </w:p>
-    <w:p>
-      <w:pPr>
-        <w:autoSpaceDE w:val="0"/>
-        <w:autoSpaceDN w:val="0"/>
-        <w:adjustRightInd w:val="0"/>
-        <w:rPr>
-          <w:rFonts w:ascii="Arial" w:hAnsi="Arial" w:cs="Arial"/>
-          <w:lang w:val="en-US"/>
-        </w:rPr>
-      </w:pPr>
-    </w:p>
-    <w:p>
-      <w:pPr>
-        <w:autoSpaceDE w:val="0"/>
-        <w:autoSpaceDN w:val="0"/>
-        <w:adjustRightInd w:val="0"/>
-        <w:rPr>
-          <w:rFonts w:ascii="Arial" w:hAnsi="Arial" w:cs="Arial"/>
-          <w:lang w:val="en-US"/>
-        </w:rPr>
-      </w:pPr>
-    </w:p>
-    <w:p>
-      <w:pPr>
-        <w:autoSpaceDE w:val="0"/>
-        <w:autoSpaceDN w:val="0"/>
-        <w:adjustRightInd w:val="0"/>
-        <w:rPr>
-          <w:rFonts w:ascii="Arial" w:hAnsi="Arial" w:cs="Arial"/>
-          <w:lang w:val="en-US"/>
-        </w:rPr>
-      </w:pPr>
-    </w:p>
-    <w:p>
-      <w:pPr>
-        <w:autoSpaceDE w:val="0"/>
-        <w:autoSpaceDN w:val="0"/>
-        <w:adjustRightInd w:val="0"/>
-        <w:rPr>
-          <w:rFonts w:ascii="Arial" w:hAnsi="Arial" w:cs="Arial"/>
-          <w:lang w:val="en-US"/>
-        </w:rPr>
-      </w:pPr>
-    </w:p>
-    <w:p>
-      <w:pPr>
-        <w:autoSpaceDE w:val="0"/>
-        <w:autoSpaceDN w:val="0"/>
-        <w:adjustRightInd w:val="0"/>
-        <w:rPr>
-          <w:rFonts w:ascii="Arial" w:hAnsi="Arial" w:cs="Arial"/>
-          <w:lang w:val="en-US"/>
-        </w:rPr>
-      </w:pPr>
-    </w:p>
-    <w:p>
-      <w:pPr>
-        <w:autoSpaceDE w:val="0"/>
-        <w:autoSpaceDN w:val="0"/>
-        <w:adjustRightInd w:val="0"/>
-        <w:rPr>
-          <w:rFonts w:ascii="Arial" w:hAnsi="Arial" w:cs="Arial"/>
-          <w:lang w:val="en-US"/>
-        </w:rPr>
-      </w:pPr>
-    </w:p>
-    <w:p>
-      <w:pPr>
-        <w:autoSpaceDE w:val="0"/>
-        <w:autoSpaceDN w:val="0"/>
-        <w:adjustRightInd w:val="0"/>
-        <w:rPr>
-          <w:rFonts w:ascii="Arial" w:hAnsi="Arial" w:cs="Arial"/>
-          <w:lang w:val="en-US"/>
-        </w:rPr>
-      </w:pPr>
-    </w:p>
-    <w:p>
-      <w:pPr>
-        <w:autoSpaceDE w:val="0"/>
-        <w:autoSpaceDN w:val="0"/>
-        <w:adjustRightInd w:val="0"/>
-        <w:rPr>
-          <w:rFonts w:ascii="Arial" w:hAnsi="Arial" w:cs="Arial"/>
-          <w:lang w:val="en-US"/>
-        </w:rPr>
-      </w:pPr>
-    </w:p>
-    <w:p>
-      <w:pPr>
-        <w:autoSpaceDE w:val="0"/>
-        <w:autoSpaceDN w:val="0"/>
-        <w:adjustRightInd w:val="0"/>
-        <w:rPr>
-          <w:rFonts w:ascii="Arial" w:hAnsi="Arial" w:cs="Arial"/>
-          <w:lang w:val="en-US"/>
-        </w:rPr>
-      </w:pPr>
-    </w:p>
-    <w:p>
-      <w:pPr>
-        <w:autoSpaceDE w:val="0"/>
-        <w:autoSpaceDN w:val="0"/>
-        <w:adjustRightInd w:val="0"/>
-        <w:rPr>
-          <w:rFonts w:ascii="Arial" w:hAnsi="Arial" w:cs="Arial"/>
-          <w:lang w:val="en-US"/>
-        </w:rPr>
-      </w:pPr>
-    </w:p>
-    <w:p>
-      <w:pPr>
-        <w:autoSpaceDE w:val="0"/>
-        <w:autoSpaceDN w:val="0"/>
-        <w:adjustRightInd w:val="0"/>
-        <w:rPr>
-          <w:rFonts w:ascii="Arial" w:hAnsi="Arial" w:cs="Arial"/>
-          <w:lang w:val="en-US"/>
-        </w:rPr>
-      </w:pPr>
-    </w:p>
-    <w:p>
-      <w:pPr>
-        <w:autoSpaceDE w:val="0"/>
-        <w:autoSpaceDN w:val="0"/>
-        <w:adjustRightInd w:val="0"/>
-        <w:rPr>
-          <w:rFonts w:ascii="Arial" w:hAnsi="Arial" w:cs="Arial"/>
-          <w:lang w:val="en-US"/>
-        </w:rPr>
-      </w:pPr>
-    </w:p>
-    <w:p>
-      <w:pPr>
-        <w:pStyle w:val="ListParagraph"/>
-        <w:autoSpaceDE w:val="0"/>
-        <w:autoSpaceDN w:val="0"/>
-        <w:adjustRightInd w:val="0"/>
-        <w:ind w:left="1440"/>
-        <w:rPr>
-          <w:rFonts w:ascii="Arial" w:hAnsi="Arial" w:cs="Arial"/>
-          <w:lang w:val="en-US"/>
-        </w:rPr>
-      </w:pPr>
-    </w:p>
-    <w:p>
-      <w:pPr>
         <w:pStyle w:val="ListParagraph"/>
         <w:numPr>
           <w:ilvl w:val="0"/>
@@ -8188,16 +7909,14 @@
           <w:rFonts w:ascii="Arial" w:hAnsi="Arial" w:cs="Arial"/>
           <w:lang w:val="en-US"/>
         </w:rPr>
-        <w:t>Sequence Diagrams</w:t>
-      </w:r>
-    </w:p>
-    <w:p>
-      <w:pPr>
-        <w:pStyle w:val="ListParagraph"/>
+        <w:t>Activity Diagrams</w:t>
+      </w:r>
+    </w:p>
+    <w:p>
+      <w:pPr>
         <w:autoSpaceDE w:val="0"/>
         <w:autoSpaceDN w:val="0"/>
         <w:adjustRightInd w:val="0"/>
-        <w:ind w:left="1440"/>
         <w:rPr>
           <w:rFonts w:ascii="Arial" w:hAnsi="Arial" w:cs="Arial"/>
           <w:lang w:val="en-US"/>
@@ -8209,10 +7928,10 @@
           <w:noProof/>
         </w:rPr>
         <w:drawing>
-          <wp:inline distT="0" distB="0" distL="0" distR="0" wp14:anchorId="46F6612D" wp14:editId="74FADA81">
-            <wp:extent cx="5267325" cy="4943475"/>
-            <wp:effectExtent l="0" t="0" r="9525" b="9525"/>
-            <wp:docPr id="3" name="Picture 3"/>
+          <wp:inline distT="0" distB="0" distL="0" distR="0" wp14:anchorId="4D9C7A8C" wp14:editId="5F7DC42C">
+            <wp:extent cx="5486400" cy="3795395"/>
+            <wp:effectExtent l="0" t="0" r="0" b="0"/>
+            <wp:docPr id="2" name="Picture 2"/>
             <wp:cNvGraphicFramePr>
               <a:graphicFrameLocks xmlns:a="http://schemas.openxmlformats.org/drawingml/2006/main" noChangeAspect="1"/>
             </wp:cNvGraphicFramePr>
@@ -8232,7 +7951,7 @@
                   <pic:spPr>
                     <a:xfrm>
                       <a:off x="0" y="0"/>
-                      <a:ext cx="5267325" cy="4943475"/>
+                      <a:ext cx="5486400" cy="3795395"/>
                     </a:xfrm>
                     <a:prstGeom prst="rect">
                       <a:avLst/>
@@ -8247,11 +7966,9 @@
     </w:p>
     <w:p>
       <w:pPr>
-        <w:pStyle w:val="ListParagraph"/>
         <w:autoSpaceDE w:val="0"/>
         <w:autoSpaceDN w:val="0"/>
         <w:adjustRightInd w:val="0"/>
-        <w:ind w:left="1440"/>
         <w:rPr>
           <w:rFonts w:ascii="Arial" w:hAnsi="Arial" w:cs="Arial"/>
           <w:lang w:val="en-US"/>
@@ -8260,11 +7977,9 @@
     </w:p>
     <w:p>
       <w:pPr>
-        <w:pStyle w:val="ListParagraph"/>
         <w:autoSpaceDE w:val="0"/>
         <w:autoSpaceDN w:val="0"/>
         <w:adjustRightInd w:val="0"/>
-        <w:ind w:left="1440"/>
         <w:rPr>
           <w:rFonts w:ascii="Arial" w:hAnsi="Arial" w:cs="Arial"/>
           <w:lang w:val="en-US"/>
@@ -8273,193 +7988,9 @@
     </w:p>
     <w:p>
       <w:pPr>
-        <w:pStyle w:val="ListParagraph"/>
         <w:autoSpaceDE w:val="0"/>
         <w:autoSpaceDN w:val="0"/>
         <w:adjustRightInd w:val="0"/>
-        <w:ind w:left="1440"/>
-        <w:rPr>
-          <w:rFonts w:ascii="Arial" w:hAnsi="Arial" w:cs="Arial"/>
-          <w:lang w:val="en-US"/>
-        </w:rPr>
-      </w:pPr>
-    </w:p>
-    <w:p>
-      <w:pPr>
-        <w:pStyle w:val="ListParagraph"/>
-        <w:autoSpaceDE w:val="0"/>
-        <w:autoSpaceDN w:val="0"/>
-        <w:adjustRightInd w:val="0"/>
-        <w:ind w:left="1440"/>
-        <w:rPr>
-          <w:rFonts w:ascii="Arial" w:hAnsi="Arial" w:cs="Arial"/>
-          <w:lang w:val="en-US"/>
-        </w:rPr>
-      </w:pPr>
-    </w:p>
-    <w:p>
-      <w:pPr>
-        <w:pStyle w:val="ListParagraph"/>
-        <w:autoSpaceDE w:val="0"/>
-        <w:autoSpaceDN w:val="0"/>
-        <w:adjustRightInd w:val="0"/>
-        <w:ind w:left="1440"/>
-        <w:rPr>
-          <w:rFonts w:ascii="Arial" w:hAnsi="Arial" w:cs="Arial"/>
-          <w:lang w:val="en-US"/>
-        </w:rPr>
-      </w:pPr>
-    </w:p>
-    <w:p>
-      <w:pPr>
-        <w:pStyle w:val="ListParagraph"/>
-        <w:autoSpaceDE w:val="0"/>
-        <w:autoSpaceDN w:val="0"/>
-        <w:adjustRightInd w:val="0"/>
-        <w:ind w:left="1440"/>
-        <w:rPr>
-          <w:rFonts w:ascii="Arial" w:hAnsi="Arial" w:cs="Arial"/>
-          <w:lang w:val="en-US"/>
-        </w:rPr>
-      </w:pPr>
-    </w:p>
-    <w:p>
-      <w:pPr>
-        <w:pStyle w:val="ListParagraph"/>
-        <w:autoSpaceDE w:val="0"/>
-        <w:autoSpaceDN w:val="0"/>
-        <w:adjustRightInd w:val="0"/>
-        <w:ind w:left="1440"/>
-        <w:rPr>
-          <w:rFonts w:ascii="Arial" w:hAnsi="Arial" w:cs="Arial"/>
-          <w:lang w:val="en-US"/>
-        </w:rPr>
-      </w:pPr>
-    </w:p>
-    <w:p>
-      <w:pPr>
-        <w:pStyle w:val="ListParagraph"/>
-        <w:autoSpaceDE w:val="0"/>
-        <w:autoSpaceDN w:val="0"/>
-        <w:adjustRightInd w:val="0"/>
-        <w:ind w:left="1440"/>
-        <w:rPr>
-          <w:rFonts w:ascii="Arial" w:hAnsi="Arial" w:cs="Arial"/>
-          <w:lang w:val="en-US"/>
-        </w:rPr>
-      </w:pPr>
-    </w:p>
-    <w:p>
-      <w:pPr>
-        <w:pStyle w:val="ListParagraph"/>
-        <w:autoSpaceDE w:val="0"/>
-        <w:autoSpaceDN w:val="0"/>
-        <w:adjustRightInd w:val="0"/>
-        <w:ind w:left="1440"/>
-        <w:rPr>
-          <w:rFonts w:ascii="Arial" w:hAnsi="Arial" w:cs="Arial"/>
-          <w:lang w:val="en-US"/>
-        </w:rPr>
-      </w:pPr>
-    </w:p>
-    <w:p>
-      <w:pPr>
-        <w:pStyle w:val="ListParagraph"/>
-        <w:autoSpaceDE w:val="0"/>
-        <w:autoSpaceDN w:val="0"/>
-        <w:adjustRightInd w:val="0"/>
-        <w:ind w:left="1440"/>
-        <w:rPr>
-          <w:rFonts w:ascii="Arial" w:hAnsi="Arial" w:cs="Arial"/>
-          <w:lang w:val="en-US"/>
-        </w:rPr>
-      </w:pPr>
-    </w:p>
-    <w:p>
-      <w:pPr>
-        <w:pStyle w:val="ListParagraph"/>
-        <w:autoSpaceDE w:val="0"/>
-        <w:autoSpaceDN w:val="0"/>
-        <w:adjustRightInd w:val="0"/>
-        <w:ind w:left="1440"/>
-        <w:rPr>
-          <w:rFonts w:ascii="Arial" w:hAnsi="Arial" w:cs="Arial"/>
-          <w:lang w:val="en-US"/>
-        </w:rPr>
-      </w:pPr>
-    </w:p>
-    <w:p>
-      <w:pPr>
-        <w:pStyle w:val="ListParagraph"/>
-        <w:autoSpaceDE w:val="0"/>
-        <w:autoSpaceDN w:val="0"/>
-        <w:adjustRightInd w:val="0"/>
-        <w:ind w:left="1440"/>
-        <w:rPr>
-          <w:rFonts w:ascii="Arial" w:hAnsi="Arial" w:cs="Arial"/>
-          <w:lang w:val="en-US"/>
-        </w:rPr>
-      </w:pPr>
-    </w:p>
-    <w:p>
-      <w:pPr>
-        <w:pStyle w:val="ListParagraph"/>
-        <w:autoSpaceDE w:val="0"/>
-        <w:autoSpaceDN w:val="0"/>
-        <w:adjustRightInd w:val="0"/>
-        <w:ind w:left="1440"/>
-        <w:rPr>
-          <w:rFonts w:ascii="Arial" w:hAnsi="Arial" w:cs="Arial"/>
-          <w:lang w:val="en-US"/>
-        </w:rPr>
-      </w:pPr>
-    </w:p>
-    <w:p>
-      <w:pPr>
-        <w:pStyle w:val="ListParagraph"/>
-        <w:autoSpaceDE w:val="0"/>
-        <w:autoSpaceDN w:val="0"/>
-        <w:adjustRightInd w:val="0"/>
-        <w:ind w:left="1440"/>
-        <w:rPr>
-          <w:rFonts w:ascii="Arial" w:hAnsi="Arial" w:cs="Arial"/>
-          <w:lang w:val="en-US"/>
-        </w:rPr>
-      </w:pPr>
-    </w:p>
-    <w:p>
-      <w:pPr>
-        <w:pStyle w:val="ListParagraph"/>
-        <w:autoSpaceDE w:val="0"/>
-        <w:autoSpaceDN w:val="0"/>
-        <w:adjustRightInd w:val="0"/>
-        <w:ind w:left="1440"/>
-        <w:rPr>
-          <w:rFonts w:ascii="Arial" w:hAnsi="Arial" w:cs="Arial"/>
-          <w:lang w:val="en-US"/>
-        </w:rPr>
-      </w:pPr>
-    </w:p>
-    <w:p>
-      <w:pPr>
-        <w:pStyle w:val="ListParagraph"/>
-        <w:autoSpaceDE w:val="0"/>
-        <w:autoSpaceDN w:val="0"/>
-        <w:adjustRightInd w:val="0"/>
-        <w:ind w:left="1440"/>
-        <w:rPr>
-          <w:rFonts w:ascii="Arial" w:hAnsi="Arial" w:cs="Arial"/>
-          <w:lang w:val="en-US"/>
-        </w:rPr>
-      </w:pPr>
-    </w:p>
-    <w:p>
-      <w:pPr>
-        <w:pStyle w:val="ListParagraph"/>
-        <w:autoSpaceDE w:val="0"/>
-        <w:autoSpaceDN w:val="0"/>
-        <w:adjustRightInd w:val="0"/>
-        <w:ind w:left="1440"/>
         <w:rPr>
           <w:rFonts w:ascii="Arial" w:hAnsi="Arial" w:cs="Arial"/>
           <w:lang w:val="en-US"/>
@@ -8499,7 +8030,7 @@
           <w:rFonts w:ascii="Arial" w:hAnsi="Arial" w:cs="Arial"/>
           <w:lang w:val="en-US"/>
         </w:rPr>
-        <w:t>UML Class Diagram</w:t>
+        <w:t>Sequence Diagrams</w:t>
       </w:r>
     </w:p>
     <w:p>
@@ -8507,21 +8038,22 @@
         <w:autoSpaceDE w:val="0"/>
         <w:autoSpaceDN w:val="0"/>
         <w:adjustRightInd w:val="0"/>
-        <w:ind w:left="1080"/>
         <w:rPr>
           <w:rFonts w:ascii="Arial" w:hAnsi="Arial" w:cs="Arial"/>
           <w:lang w:val="en-US"/>
         </w:rPr>
       </w:pPr>
+      <w:bookmarkStart w:id="21" w:name="_GoBack"/>
+      <w:bookmarkEnd w:id="21"/>
       <w:r>
         <w:rPr>
           <w:noProof/>
         </w:rPr>
         <w:drawing>
-          <wp:inline distT="0" distB="0" distL="0" distR="0" wp14:anchorId="237C4C78" wp14:editId="1F9F38F3">
-            <wp:extent cx="5486400" cy="4389120"/>
-            <wp:effectExtent l="0" t="0" r="0" b="0"/>
-            <wp:docPr id="5" name="Picture 5"/>
+          <wp:inline distT="0" distB="0" distL="0" distR="0" wp14:anchorId="46F6612D" wp14:editId="74FADA81">
+            <wp:extent cx="5267325" cy="4943475"/>
+            <wp:effectExtent l="0" t="0" r="9525" b="9525"/>
+            <wp:docPr id="3" name="Picture 3"/>
             <wp:cNvGraphicFramePr>
               <a:graphicFrameLocks xmlns:a="http://schemas.openxmlformats.org/drawingml/2006/main" noChangeAspect="1"/>
             </wp:cNvGraphicFramePr>
@@ -8541,7 +8073,7 @@
                   <pic:spPr>
                     <a:xfrm>
                       <a:off x="0" y="0"/>
-                      <a:ext cx="5486400" cy="4389120"/>
+                      <a:ext cx="5267325" cy="4943475"/>
                     </a:xfrm>
                     <a:prstGeom prst="rect">
                       <a:avLst/>
@@ -8556,81 +8088,281 @@
     </w:p>
     <w:p>
       <w:pPr>
-        <w:rPr>
-          <w:rFonts w:ascii="Arial" w:hAnsi="Arial" w:cs="Arial"/>
-        </w:rPr>
-      </w:pPr>
-    </w:p>
-    <w:p>
-      <w:pPr>
-        <w:rPr>
-          <w:rFonts w:ascii="Arial" w:hAnsi="Arial" w:cs="Arial"/>
-          <w:b/>
-        </w:rPr>
-      </w:pPr>
-      <w:r>
-        <w:rPr>
-          <w:rFonts w:ascii="Arial" w:hAnsi="Arial" w:cs="Arial"/>
-        </w:rPr>
-        <w:t xml:space="preserve">     </w:t>
-      </w:r>
-      <w:r>
-        <w:rPr>
-          <w:rFonts w:ascii="Arial" w:hAnsi="Arial" w:cs="Arial"/>
-          <w:b/>
-        </w:rPr>
-        <w:t>3.</w:t>
-      </w:r>
-      <w:r>
-        <w:rPr>
-          <w:rFonts w:ascii="Arial" w:hAnsi="Arial" w:cs="Arial"/>
-          <w:b/>
-        </w:rPr>
-        <w:t>4</w:t>
-      </w:r>
-      <w:r>
-        <w:rPr>
-          <w:rFonts w:ascii="Arial" w:hAnsi="Arial" w:cs="Arial"/>
-          <w:b/>
-        </w:rPr>
-        <w:t xml:space="preserve"> Process Modelling</w:t>
-      </w:r>
+        <w:pStyle w:val="ListParagraph"/>
+        <w:autoSpaceDE w:val="0"/>
+        <w:autoSpaceDN w:val="0"/>
+        <w:adjustRightInd w:val="0"/>
+        <w:ind w:left="1440"/>
+        <w:rPr>
+          <w:rFonts w:ascii="Arial" w:hAnsi="Arial" w:cs="Arial"/>
+          <w:lang w:val="en-US"/>
+        </w:rPr>
+      </w:pPr>
+    </w:p>
+    <w:p>
+      <w:pPr>
+        <w:pStyle w:val="ListParagraph"/>
+        <w:autoSpaceDE w:val="0"/>
+        <w:autoSpaceDN w:val="0"/>
+        <w:adjustRightInd w:val="0"/>
+        <w:ind w:left="1440"/>
+        <w:rPr>
+          <w:rFonts w:ascii="Arial" w:hAnsi="Arial" w:cs="Arial"/>
+          <w:lang w:val="en-US"/>
+        </w:rPr>
+      </w:pPr>
+    </w:p>
+    <w:p>
+      <w:pPr>
+        <w:pStyle w:val="ListParagraph"/>
+        <w:autoSpaceDE w:val="0"/>
+        <w:autoSpaceDN w:val="0"/>
+        <w:adjustRightInd w:val="0"/>
+        <w:ind w:left="1440"/>
+        <w:rPr>
+          <w:rFonts w:ascii="Arial" w:hAnsi="Arial" w:cs="Arial"/>
+          <w:lang w:val="en-US"/>
+        </w:rPr>
+      </w:pPr>
+    </w:p>
+    <w:p>
+      <w:pPr>
+        <w:pStyle w:val="ListParagraph"/>
+        <w:autoSpaceDE w:val="0"/>
+        <w:autoSpaceDN w:val="0"/>
+        <w:adjustRightInd w:val="0"/>
+        <w:ind w:left="1440"/>
+        <w:rPr>
+          <w:rFonts w:ascii="Arial" w:hAnsi="Arial" w:cs="Arial"/>
+          <w:lang w:val="en-US"/>
+        </w:rPr>
+      </w:pPr>
+    </w:p>
+    <w:p>
+      <w:pPr>
+        <w:pStyle w:val="ListParagraph"/>
+        <w:autoSpaceDE w:val="0"/>
+        <w:autoSpaceDN w:val="0"/>
+        <w:adjustRightInd w:val="0"/>
+        <w:ind w:left="1440"/>
+        <w:rPr>
+          <w:rFonts w:ascii="Arial" w:hAnsi="Arial" w:cs="Arial"/>
+          <w:lang w:val="en-US"/>
+        </w:rPr>
+      </w:pPr>
+    </w:p>
+    <w:p>
+      <w:pPr>
+        <w:pStyle w:val="ListParagraph"/>
+        <w:autoSpaceDE w:val="0"/>
+        <w:autoSpaceDN w:val="0"/>
+        <w:adjustRightInd w:val="0"/>
+        <w:ind w:left="1440"/>
+        <w:rPr>
+          <w:rFonts w:ascii="Arial" w:hAnsi="Arial" w:cs="Arial"/>
+          <w:lang w:val="en-US"/>
+        </w:rPr>
+      </w:pPr>
+    </w:p>
+    <w:p>
+      <w:pPr>
+        <w:pStyle w:val="ListParagraph"/>
+        <w:autoSpaceDE w:val="0"/>
+        <w:autoSpaceDN w:val="0"/>
+        <w:adjustRightInd w:val="0"/>
+        <w:ind w:left="1440"/>
+        <w:rPr>
+          <w:rFonts w:ascii="Arial" w:hAnsi="Arial" w:cs="Arial"/>
+          <w:lang w:val="en-US"/>
+        </w:rPr>
+      </w:pPr>
+    </w:p>
+    <w:p>
+      <w:pPr>
+        <w:pStyle w:val="ListParagraph"/>
+        <w:autoSpaceDE w:val="0"/>
+        <w:autoSpaceDN w:val="0"/>
+        <w:adjustRightInd w:val="0"/>
+        <w:ind w:left="1440"/>
+        <w:rPr>
+          <w:rFonts w:ascii="Arial" w:hAnsi="Arial" w:cs="Arial"/>
+          <w:lang w:val="en-US"/>
+        </w:rPr>
+      </w:pPr>
+    </w:p>
+    <w:p>
+      <w:pPr>
+        <w:pStyle w:val="ListParagraph"/>
+        <w:autoSpaceDE w:val="0"/>
+        <w:autoSpaceDN w:val="0"/>
+        <w:adjustRightInd w:val="0"/>
+        <w:ind w:left="1440"/>
+        <w:rPr>
+          <w:rFonts w:ascii="Arial" w:hAnsi="Arial" w:cs="Arial"/>
+          <w:lang w:val="en-US"/>
+        </w:rPr>
+      </w:pPr>
+    </w:p>
+    <w:p>
+      <w:pPr>
+        <w:pStyle w:val="ListParagraph"/>
+        <w:autoSpaceDE w:val="0"/>
+        <w:autoSpaceDN w:val="0"/>
+        <w:adjustRightInd w:val="0"/>
+        <w:ind w:left="1440"/>
+        <w:rPr>
+          <w:rFonts w:ascii="Arial" w:hAnsi="Arial" w:cs="Arial"/>
+          <w:lang w:val="en-US"/>
+        </w:rPr>
+      </w:pPr>
+    </w:p>
+    <w:p>
+      <w:pPr>
+        <w:pStyle w:val="ListParagraph"/>
+        <w:autoSpaceDE w:val="0"/>
+        <w:autoSpaceDN w:val="0"/>
+        <w:adjustRightInd w:val="0"/>
+        <w:ind w:left="1440"/>
+        <w:rPr>
+          <w:rFonts w:ascii="Arial" w:hAnsi="Arial" w:cs="Arial"/>
+          <w:lang w:val="en-US"/>
+        </w:rPr>
+      </w:pPr>
+    </w:p>
+    <w:p>
+      <w:pPr>
+        <w:pStyle w:val="ListParagraph"/>
+        <w:autoSpaceDE w:val="0"/>
+        <w:autoSpaceDN w:val="0"/>
+        <w:adjustRightInd w:val="0"/>
+        <w:ind w:left="1440"/>
+        <w:rPr>
+          <w:rFonts w:ascii="Arial" w:hAnsi="Arial" w:cs="Arial"/>
+          <w:lang w:val="en-US"/>
+        </w:rPr>
+      </w:pPr>
+    </w:p>
+    <w:p>
+      <w:pPr>
+        <w:pStyle w:val="ListParagraph"/>
+        <w:autoSpaceDE w:val="0"/>
+        <w:autoSpaceDN w:val="0"/>
+        <w:adjustRightInd w:val="0"/>
+        <w:ind w:left="1440"/>
+        <w:rPr>
+          <w:rFonts w:ascii="Arial" w:hAnsi="Arial" w:cs="Arial"/>
+          <w:lang w:val="en-US"/>
+        </w:rPr>
+      </w:pPr>
+    </w:p>
+    <w:p>
+      <w:pPr>
+        <w:pStyle w:val="ListParagraph"/>
+        <w:autoSpaceDE w:val="0"/>
+        <w:autoSpaceDN w:val="0"/>
+        <w:adjustRightInd w:val="0"/>
+        <w:ind w:left="1440"/>
+        <w:rPr>
+          <w:rFonts w:ascii="Arial" w:hAnsi="Arial" w:cs="Arial"/>
+          <w:lang w:val="en-US"/>
+        </w:rPr>
+      </w:pPr>
+    </w:p>
+    <w:p>
+      <w:pPr>
+        <w:pStyle w:val="ListParagraph"/>
+        <w:autoSpaceDE w:val="0"/>
+        <w:autoSpaceDN w:val="0"/>
+        <w:adjustRightInd w:val="0"/>
+        <w:ind w:left="1440"/>
+        <w:rPr>
+          <w:rFonts w:ascii="Arial" w:hAnsi="Arial" w:cs="Arial"/>
+          <w:lang w:val="en-US"/>
+        </w:rPr>
+      </w:pPr>
+    </w:p>
+    <w:p>
+      <w:pPr>
+        <w:pStyle w:val="ListParagraph"/>
+        <w:autoSpaceDE w:val="0"/>
+        <w:autoSpaceDN w:val="0"/>
+        <w:adjustRightInd w:val="0"/>
+        <w:ind w:left="1440"/>
+        <w:rPr>
+          <w:rFonts w:ascii="Arial" w:hAnsi="Arial" w:cs="Arial"/>
+          <w:lang w:val="en-US"/>
+        </w:rPr>
+      </w:pPr>
+    </w:p>
+    <w:p>
+      <w:pPr>
+        <w:pStyle w:val="ListParagraph"/>
+        <w:autoSpaceDE w:val="0"/>
+        <w:autoSpaceDN w:val="0"/>
+        <w:adjustRightInd w:val="0"/>
+        <w:ind w:left="1440"/>
+        <w:rPr>
+          <w:rFonts w:ascii="Arial" w:hAnsi="Arial" w:cs="Arial"/>
+          <w:lang w:val="en-US"/>
+        </w:rPr>
+      </w:pPr>
+    </w:p>
+    <w:p>
+      <w:pPr>
+        <w:pStyle w:val="ListParagraph"/>
+        <w:autoSpaceDE w:val="0"/>
+        <w:autoSpaceDN w:val="0"/>
+        <w:adjustRightInd w:val="0"/>
+        <w:ind w:left="1440"/>
+        <w:rPr>
+          <w:rFonts w:ascii="Arial" w:hAnsi="Arial" w:cs="Arial"/>
+          <w:lang w:val="en-US"/>
+        </w:rPr>
+      </w:pPr>
     </w:p>
     <w:p>
       <w:pPr>
         <w:pStyle w:val="ListParagraph"/>
         <w:numPr>
           <w:ilvl w:val="0"/>
-          <w:numId w:val="22"/>
+          <w:numId w:val="21"/>
         </w:numPr>
-        <w:ind w:left="1440"/>
-        <w:rPr>
-          <w:rFonts w:ascii="Arial" w:hAnsi="Arial" w:cs="Arial"/>
-        </w:rPr>
-      </w:pPr>
-      <w:r>
-        <w:rPr>
-          <w:rFonts w:ascii="Arial" w:hAnsi="Arial" w:cs="Arial"/>
-        </w:rPr>
-        <w:t>Data Flow Diagram</w:t>
-      </w:r>
-    </w:p>
-    <w:p>
-      <w:pPr>
-        <w:rPr>
-          <w:rFonts w:ascii="Arial" w:hAnsi="Arial" w:cs="Arial"/>
-        </w:rPr>
-      </w:pPr>
-      <w:r>
-        <w:rPr>
-          <w:rFonts w:ascii="Arial" w:hAnsi="Arial" w:cs="Arial"/>
+        <w:autoSpaceDE w:val="0"/>
+        <w:autoSpaceDN w:val="0"/>
+        <w:adjustRightInd w:val="0"/>
+        <w:rPr>
+          <w:rFonts w:ascii="Arial" w:hAnsi="Arial" w:cs="Arial"/>
+          <w:lang w:val="en-US"/>
+        </w:rPr>
+      </w:pPr>
+      <w:r>
+        <w:rPr>
+          <w:rFonts w:ascii="Arial" w:hAnsi="Arial" w:cs="Arial"/>
+          <w:lang w:val="en-US"/>
+        </w:rPr>
+        <w:t>UML Class Diagram</w:t>
+      </w:r>
+    </w:p>
+    <w:p>
+      <w:pPr>
+        <w:autoSpaceDE w:val="0"/>
+        <w:autoSpaceDN w:val="0"/>
+        <w:adjustRightInd w:val="0"/>
+        <w:ind w:left="1080"/>
+        <w:rPr>
+          <w:rFonts w:ascii="Arial" w:hAnsi="Arial" w:cs="Arial"/>
+          <w:lang w:val="en-US"/>
+        </w:rPr>
+      </w:pPr>
+      <w:r>
+        <w:rPr>
           <w:noProof/>
         </w:rPr>
         <w:drawing>
-          <wp:inline distT="0" distB="0" distL="0" distR="0" wp14:anchorId="0999DF1C" wp14:editId="3D0E9938">
-            <wp:extent cx="5486400" cy="2602865"/>
+          <wp:inline distT="0" distB="0" distL="0" distR="0" wp14:anchorId="237C4C78" wp14:editId="1F9F38F3">
+            <wp:extent cx="5486400" cy="4389120"/>
             <wp:effectExtent l="0" t="0" r="0" b="0"/>
-            <wp:docPr id="1" name="Picture 1"/>
+            <wp:docPr id="5" name="Picture 5"/>
             <wp:cNvGraphicFramePr>
               <a:graphicFrameLocks xmlns:a="http://schemas.openxmlformats.org/drawingml/2006/main" noChangeAspect="1"/>
             </wp:cNvGraphicFramePr>
@@ -8650,6 +8382,115 @@
                   <pic:spPr>
                     <a:xfrm>
                       <a:off x="0" y="0"/>
+                      <a:ext cx="5486400" cy="4389120"/>
+                    </a:xfrm>
+                    <a:prstGeom prst="rect">
+                      <a:avLst/>
+                    </a:prstGeom>
+                  </pic:spPr>
+                </pic:pic>
+              </a:graphicData>
+            </a:graphic>
+          </wp:inline>
+        </w:drawing>
+      </w:r>
+    </w:p>
+    <w:p>
+      <w:pPr>
+        <w:rPr>
+          <w:rFonts w:ascii="Arial" w:hAnsi="Arial" w:cs="Arial"/>
+        </w:rPr>
+      </w:pPr>
+    </w:p>
+    <w:p>
+      <w:pPr>
+        <w:rPr>
+          <w:rFonts w:ascii="Arial" w:hAnsi="Arial" w:cs="Arial"/>
+          <w:b/>
+        </w:rPr>
+      </w:pPr>
+      <w:r>
+        <w:rPr>
+          <w:rFonts w:ascii="Arial" w:hAnsi="Arial" w:cs="Arial"/>
+        </w:rPr>
+        <w:t xml:space="preserve">     </w:t>
+      </w:r>
+      <w:r>
+        <w:rPr>
+          <w:rFonts w:ascii="Arial" w:hAnsi="Arial" w:cs="Arial"/>
+          <w:b/>
+        </w:rPr>
+        <w:t>3.</w:t>
+      </w:r>
+      <w:r>
+        <w:rPr>
+          <w:rFonts w:ascii="Arial" w:hAnsi="Arial" w:cs="Arial"/>
+          <w:b/>
+        </w:rPr>
+        <w:t>4</w:t>
+      </w:r>
+      <w:r>
+        <w:rPr>
+          <w:rFonts w:ascii="Arial" w:hAnsi="Arial" w:cs="Arial"/>
+          <w:b/>
+        </w:rPr>
+        <w:t xml:space="preserve"> Process Modelling</w:t>
+      </w:r>
+    </w:p>
+    <w:p>
+      <w:pPr>
+        <w:pStyle w:val="ListParagraph"/>
+        <w:numPr>
+          <w:ilvl w:val="0"/>
+          <w:numId w:val="22"/>
+        </w:numPr>
+        <w:ind w:left="1440"/>
+        <w:rPr>
+          <w:rFonts w:ascii="Arial" w:hAnsi="Arial" w:cs="Arial"/>
+        </w:rPr>
+      </w:pPr>
+      <w:r>
+        <w:rPr>
+          <w:rFonts w:ascii="Arial" w:hAnsi="Arial" w:cs="Arial"/>
+        </w:rPr>
+        <w:t>Data Flow Diagram</w:t>
+      </w:r>
+    </w:p>
+    <w:p>
+      <w:pPr>
+        <w:rPr>
+          <w:rFonts w:ascii="Arial" w:hAnsi="Arial" w:cs="Arial"/>
+        </w:rPr>
+      </w:pPr>
+      <w:r>
+        <w:rPr>
+          <w:rFonts w:ascii="Arial" w:hAnsi="Arial" w:cs="Arial"/>
+          <w:noProof/>
+        </w:rPr>
+        <w:drawing>
+          <wp:inline distT="0" distB="0" distL="0" distR="0" wp14:anchorId="0999DF1C" wp14:editId="3D0E9938">
+            <wp:extent cx="5486400" cy="2602865"/>
+            <wp:effectExtent l="0" t="0" r="0" b="0"/>
+            <wp:docPr id="1" name="Picture 1"/>
+            <wp:cNvGraphicFramePr>
+              <a:graphicFrameLocks xmlns:a="http://schemas.openxmlformats.org/drawingml/2006/main" noChangeAspect="1"/>
+            </wp:cNvGraphicFramePr>
+            <a:graphic xmlns:a="http://schemas.openxmlformats.org/drawingml/2006/main">
+              <a:graphicData uri="http://schemas.openxmlformats.org/drawingml/2006/picture">
+                <pic:pic xmlns:pic="http://schemas.openxmlformats.org/drawingml/2006/picture">
+                  <pic:nvPicPr>
+                    <pic:cNvPr id="1" name=""/>
+                    <pic:cNvPicPr/>
+                  </pic:nvPicPr>
+                  <pic:blipFill>
+                    <a:blip r:embed="rId33"/>
+                    <a:stretch>
+                      <a:fillRect/>
+                    </a:stretch>
+                  </pic:blipFill>
+                  <pic:spPr>
+                    <a:xfrm>
+                      <a:off x="0" y="0"/>
                       <a:ext cx="5486400" cy="2602865"/>
                     </a:xfrm>
                     <a:prstGeom prst="rect">
@@ -8687,8 +8528,8 @@
           <w:szCs w:val="24"/>
         </w:rPr>
       </w:pPr>
-      <w:bookmarkStart w:id="21" w:name="_Toc506459164"/>
-      <w:bookmarkStart w:id="22" w:name="_Toc506458798"/>
+      <w:bookmarkStart w:id="22" w:name="_Toc506459164"/>
+      <w:bookmarkStart w:id="23" w:name="_Toc506458798"/>
       <w:r>
         <w:rPr>
           <w:rFonts w:cs="Arial"/>
@@ -8698,8 +8539,8 @@
         <w:lastRenderedPageBreak/>
         <w:t>4.0 Non-Functional Requirements</w:t>
       </w:r>
-      <w:bookmarkEnd w:id="21"/>
       <w:bookmarkEnd w:id="22"/>
+      <w:bookmarkEnd w:id="23"/>
     </w:p>
     <w:p>
       <w:pPr>
@@ -8910,8 +8751,8 @@
           <w:szCs w:val="24"/>
         </w:rPr>
       </w:pPr>
-      <w:bookmarkStart w:id="23" w:name="_Toc506459173"/>
-      <w:bookmarkStart w:id="24" w:name="_Toc506458807"/>
+      <w:bookmarkStart w:id="24" w:name="_Toc506459173"/>
+      <w:bookmarkStart w:id="25" w:name="_Toc506458807"/>
       <w:r>
         <w:rPr>
           <w:rFonts w:cs="Arial"/>
@@ -8920,8 +8761,8 @@
         </w:rPr>
         <w:t>5.0 Logical Database Requirements</w:t>
       </w:r>
-      <w:bookmarkEnd w:id="23"/>
       <w:bookmarkEnd w:id="24"/>
+      <w:bookmarkEnd w:id="25"/>
     </w:p>
     <w:p>
       <w:pPr>
@@ -9026,8 +8867,8 @@
           <w:szCs w:val="24"/>
         </w:rPr>
       </w:pPr>
-      <w:bookmarkStart w:id="25" w:name="_Toc506459174"/>
-      <w:bookmarkStart w:id="26" w:name="_Toc506458808"/>
+      <w:bookmarkStart w:id="26" w:name="_Toc506459174"/>
+      <w:bookmarkStart w:id="27" w:name="_Toc506458808"/>
       <w:r>
         <w:rPr>
           <w:i w:val="0"/>
@@ -9161,8 +9002,8 @@
         </w:rPr>
         <w:t>6.0 Other Requirements</w:t>
       </w:r>
-      <w:bookmarkEnd w:id="25"/>
       <w:bookmarkEnd w:id="26"/>
+      <w:bookmarkEnd w:id="27"/>
     </w:p>
     <w:p>
       <w:pPr>
@@ -9791,8 +9632,6 @@
               </w:rPr>
               <w:t>101054051</w:t>
             </w:r>
-            <w:bookmarkStart w:id="27" w:name="_GoBack"/>
-            <w:bookmarkEnd w:id="27"/>
           </w:p>
         </w:tc>
         <w:tc>
@@ -9843,8 +9682,8 @@
       </w:pPr>
     </w:p>
     <w:sectPr>
-      <w:headerReference w:type="default" r:id="rId33"/>
-      <w:footerReference w:type="default" r:id="rId34"/>
+      <w:headerReference w:type="default" r:id="rId34"/>
+      <w:footerReference w:type="default" r:id="rId35"/>
       <w:pgSz w:w="12240" w:h="15840"/>
       <w:pgMar w:top="1080" w:right="1800" w:bottom="1440" w:left="1800" w:header="708" w:footer="708" w:gutter="0"/>
       <w:cols w:space="708"/>

</xml_diff>